<commit_message>
UC11: Customer Plant ROI Verification - OffGrid backup analysis
- Add check_plant_roi.py: Fetch historical device data via queryDeviceDataOneDayPaging API
- Add analyze_plant_roi.py: Generate ROI reports with OffGrid metrics
- Add test_uc11_plant_roi.py: 19 integration tests (100% pass)
- Update README.md with UC11 documentation and 3-year results
- Add roi/ to .gitignore (customer data privacy)

Co-Authored-By: Claude Opus 4.5 <noreply@anthropic.com>
</commit_message>
<xml_diff>
--- a/MultiCloud_All_UCs_Complete.docx
+++ b/MultiCloud_All_UCs_Complete.docx
@@ -3713,6 +3713,625 @@
           <w:b/>
         </w:rPr>
         <w:t>[SUCCESS] 100% pass rate</w:t>
+      </w:r>
+    </w:p>
+    <w:p>
+      <w:r>
+        <w:br w:type="page"/>
+      </w:r>
+    </w:p>
+    <w:p>
+      <w:pPr>
+        <w:pStyle w:val="Heading1"/>
+      </w:pPr>
+      <w:r>
+        <w:t>UC10: Multi-Cloud Platform Support (DessMonitor)</w:t>
+      </w:r>
+    </w:p>
+    <w:p>
+      <w:r>
+        <w:rPr>
+          <w:b/>
+        </w:rPr>
+        <w:t xml:space="preserve">Implementation Status: </w:t>
+      </w:r>
+      <w:r>
+        <w:t>Phase 1 IMPLEMENTED (Session 14)</w:t>
+      </w:r>
+    </w:p>
+    <w:p>
+      <w:pPr>
+        <w:pStyle w:val="Heading2"/>
+      </w:pPr>
+      <w:r>
+        <w:t>Overview</w:t>
+      </w:r>
+    </w:p>
+    <w:p>
+      <w:r>
+        <w:t>Extends monitoring capabilities to DessMonitor platform, running in parallel with ShineMonitor. Both platforms feed into the same anomaly detection system with platform-specific state management.</w:t>
+      </w:r>
+    </w:p>
+    <w:p>
+      <w:pPr>
+        <w:pStyle w:val="Heading2"/>
+      </w:pPr>
+      <w:r>
+        <w:t>Features</w:t>
+      </w:r>
+    </w:p>
+    <w:p>
+      <w:pPr>
+        <w:pStyle w:val="ListBullet"/>
+      </w:pPr>
+      <w:r>
+        <w:t>Separate workflow (trigger-dessmonitor.yml) runs every 4 hours (offset from ShineMonitor)</w:t>
+      </w:r>
+    </w:p>
+    <w:p>
+      <w:pPr>
+        <w:pStyle w:val="ListBullet"/>
+      </w:pPr>
+      <w:r>
+        <w:t>Platform-specific credentials file (dessmonitor_credentials.json)</w:t>
+      </w:r>
+    </w:p>
+    <w:p>
+      <w:pPr>
+        <w:pStyle w:val="ListBullet"/>
+      </w:pPr>
+      <w:r>
+        <w:t>CSV naming convention: dessmonitor-{label}-{plant}-YYYY-MM.csv</w:t>
+      </w:r>
+    </w:p>
+    <w:p>
+      <w:pPr>
+        <w:pStyle w:val="ListBullet"/>
+      </w:pPr>
+      <w:r>
+        <w:t>Separate state files for alert tracking</w:t>
+      </w:r>
+    </w:p>
+    <w:p>
+      <w:pPr>
+        <w:pStyle w:val="ListBullet"/>
+      </w:pPr>
+      <w:r>
+        <w:t>Shared anomaly detection with --platform filter</w:t>
+      </w:r>
+    </w:p>
+    <w:p>
+      <w:pPr>
+        <w:pStyle w:val="ListBullet"/>
+      </w:pPr>
+      <w:r>
+        <w:t>Dual authentication fallback (authEmail -&gt; authSource)</w:t>
+      </w:r>
+    </w:p>
+    <w:p>
+      <w:pPr>
+        <w:pStyle w:val="Heading2"/>
+      </w:pPr>
+      <w:r>
+        <w:t>Platform Comparison</w:t>
+      </w:r>
+    </w:p>
+    <w:tbl>
+      <w:tblPr>
+        <w:tblStyle w:val="TableGrid"/>
+        <w:tblW w:type="auto" w:w="0"/>
+        <w:tblLook w:firstColumn="1" w:firstRow="1" w:lastColumn="0" w:lastRow="0" w:noHBand="0" w:noVBand="1" w:val="04A0"/>
+      </w:tblPr>
+      <w:tblGrid>
+        <w:gridCol w:w="2880"/>
+        <w:gridCol w:w="2880"/>
+        <w:gridCol w:w="2880"/>
+      </w:tblGrid>
+      <w:tr>
+        <w:tc>
+          <w:tcPr>
+            <w:tcW w:type="dxa" w:w="2880"/>
+          </w:tcPr>
+          <w:p>
+            <w:r>
+              <w:t>Feature</w:t>
+            </w:r>
+          </w:p>
+        </w:tc>
+        <w:tc>
+          <w:tcPr>
+            <w:tcW w:type="dxa" w:w="2880"/>
+          </w:tcPr>
+          <w:p>
+            <w:r>
+              <w:t>ShineMonitor</w:t>
+            </w:r>
+          </w:p>
+        </w:tc>
+        <w:tc>
+          <w:tcPr>
+            <w:tcW w:type="dxa" w:w="2880"/>
+          </w:tcPr>
+          <w:p>
+            <w:r>
+              <w:t>DessMonitor</w:t>
+            </w:r>
+          </w:p>
+        </w:tc>
+      </w:tr>
+      <w:tr>
+        <w:tc>
+          <w:tcPr>
+            <w:tcW w:type="dxa" w:w="2880"/>
+          </w:tcPr>
+          <w:p>
+            <w:r>
+              <w:t>Workflow</w:t>
+            </w:r>
+          </w:p>
+        </w:tc>
+        <w:tc>
+          <w:tcPr>
+            <w:tcW w:type="dxa" w:w="2880"/>
+          </w:tcPr>
+          <w:p>
+            <w:r>
+              <w:t>trigger-shinemonitor.yml</w:t>
+            </w:r>
+          </w:p>
+        </w:tc>
+        <w:tc>
+          <w:tcPr>
+            <w:tcW w:type="dxa" w:w="2880"/>
+          </w:tcPr>
+          <w:p>
+            <w:r>
+              <w:t>trigger-dessmonitor.yml</w:t>
+            </w:r>
+          </w:p>
+        </w:tc>
+      </w:tr>
+      <w:tr>
+        <w:tc>
+          <w:tcPr>
+            <w:tcW w:type="dxa" w:w="2880"/>
+          </w:tcPr>
+          <w:p>
+            <w:r>
+              <w:t>Schedule</w:t>
+            </w:r>
+          </w:p>
+        </w:tc>
+        <w:tc>
+          <w:tcPr>
+            <w:tcW w:type="dxa" w:w="2880"/>
+          </w:tcPr>
+          <w:p>
+            <w:r>
+              <w:t>02:30, 06:30, 10:30...</w:t>
+            </w:r>
+          </w:p>
+        </w:tc>
+        <w:tc>
+          <w:tcPr>
+            <w:tcW w:type="dxa" w:w="2880"/>
+          </w:tcPr>
+          <w:p>
+            <w:r>
+              <w:t>03:00, 07:00, 11:00...</w:t>
+            </w:r>
+          </w:p>
+        </w:tc>
+      </w:tr>
+      <w:tr>
+        <w:tc>
+          <w:tcPr>
+            <w:tcW w:type="dxa" w:w="2880"/>
+          </w:tcPr>
+          <w:p>
+            <w:r>
+              <w:t>Credentials</w:t>
+            </w:r>
+          </w:p>
+        </w:tc>
+        <w:tc>
+          <w:tcPr>
+            <w:tcW w:type="dxa" w:w="2880"/>
+          </w:tcPr>
+          <w:p>
+            <w:r>
+              <w:t>credentials.json</w:t>
+            </w:r>
+          </w:p>
+        </w:tc>
+        <w:tc>
+          <w:tcPr>
+            <w:tcW w:type="dxa" w:w="2880"/>
+          </w:tcPr>
+          <w:p>
+            <w:r>
+              <w:t>dessmonitor_credentials.json</w:t>
+            </w:r>
+          </w:p>
+        </w:tc>
+      </w:tr>
+      <w:tr>
+        <w:tc>
+          <w:tcPr>
+            <w:tcW w:type="dxa" w:w="2880"/>
+          </w:tcPr>
+          <w:p>
+            <w:r>
+              <w:t>CSV Prefix</w:t>
+            </w:r>
+          </w:p>
+        </w:tc>
+        <w:tc>
+          <w:tcPr>
+            <w:tcW w:type="dxa" w:w="2880"/>
+          </w:tcPr>
+          <w:p>
+            <w:r>
+              <w:t>(none)</w:t>
+            </w:r>
+          </w:p>
+        </w:tc>
+        <w:tc>
+          <w:tcPr>
+            <w:tcW w:type="dxa" w:w="2880"/>
+          </w:tcPr>
+          <w:p>
+            <w:r>
+              <w:t>dessmonitor-</w:t>
+            </w:r>
+          </w:p>
+        </w:tc>
+      </w:tr>
+      <w:tr>
+        <w:tc>
+          <w:tcPr>
+            <w:tcW w:type="dxa" w:w="2880"/>
+          </w:tcPr>
+          <w:p>
+            <w:r>
+              <w:t>State File</w:t>
+            </w:r>
+          </w:p>
+        </w:tc>
+        <w:tc>
+          <w:tcPr>
+            <w:tcW w:type="dxa" w:w="2880"/>
+          </w:tcPr>
+          <w:p>
+            <w:r>
+              <w:t>alerts_state.json</w:t>
+            </w:r>
+          </w:p>
+        </w:tc>
+        <w:tc>
+          <w:tcPr>
+            <w:tcW w:type="dxa" w:w="2880"/>
+          </w:tcPr>
+          <w:p>
+            <w:r>
+              <w:t>dessmonitor_alerts_state.json</w:t>
+            </w:r>
+          </w:p>
+        </w:tc>
+      </w:tr>
+      <w:tr>
+        <w:tc>
+          <w:tcPr>
+            <w:tcW w:type="dxa" w:w="2880"/>
+          </w:tcPr>
+          <w:p>
+            <w:r>
+              <w:t>Test Customer</w:t>
+            </w:r>
+          </w:p>
+        </w:tc>
+        <w:tc>
+          <w:tcPr>
+            <w:tcW w:type="dxa" w:w="2880"/>
+          </w:tcPr>
+          <w:p>
+            <w:r>
+              <w:t>Gayan-IMH</w:t>
+            </w:r>
+          </w:p>
+        </w:tc>
+        <w:tc>
+          <w:tcPr>
+            <w:tcW w:type="dxa" w:w="2880"/>
+          </w:tcPr>
+          <w:p>
+            <w:r>
+              <w:t>MifrazMarsoon</w:t>
+            </w:r>
+          </w:p>
+        </w:tc>
+      </w:tr>
+    </w:tbl>
+    <w:p>
+      <w:pPr>
+        <w:pStyle w:val="Heading2"/>
+      </w:pPr>
+      <w:r>
+        <w:t>API Scripts</w:t>
+      </w:r>
+    </w:p>
+    <w:p>
+      <w:pPr>
+        <w:pStyle w:val="ListBullet"/>
+      </w:pPr>
+      <w:r>
+        <w:rPr>
+          <w:b/>
+        </w:rPr>
+        <w:t>dessmonitor_common.sh</w:t>
+      </w:r>
+      <w:r>
+        <w:t xml:space="preserve"> - API client with dual auth fallback</w:t>
+      </w:r>
+    </w:p>
+    <w:p>
+      <w:pPr>
+        <w:pStyle w:val="ListBullet"/>
+      </w:pPr>
+      <w:r>
+        <w:rPr>
+          <w:b/>
+        </w:rPr>
+        <w:t>check_dessmonitor_monthly.sh</w:t>
+      </w:r>
+      <w:r>
+        <w:t xml:space="preserve"> - Monthly energy data fetcher</w:t>
+      </w:r>
+    </w:p>
+    <w:p>
+      <w:pPr>
+        <w:pStyle w:val="Heading2"/>
+      </w:pPr>
+      <w:r>
+        <w:t>GitHub Secrets Required</w:t>
+      </w:r>
+    </w:p>
+    <w:p>
+      <w:pPr>
+        <w:pStyle w:val="ListBullet"/>
+      </w:pPr>
+      <w:r>
+        <w:t>DESSMONITOR_CREDENTIALS_JSON - DessMonitor account credentials</w:t>
+      </w:r>
+    </w:p>
+    <w:p>
+      <w:pPr>
+        <w:pStyle w:val="Heading2"/>
+      </w:pPr>
+      <w:r>
+        <w:t>Test Coverage</w:t>
+      </w:r>
+    </w:p>
+    <w:p>
+      <w:r>
+        <w:t>13 tests (100% pass rate)</w:t>
+      </w:r>
+    </w:p>
+    <w:p>
+      <w:pPr>
+        <w:pStyle w:val="ListBullet"/>
+      </w:pPr>
+      <w:r>
+        <w:t>test_dessmonitor_credentials_format</w:t>
+      </w:r>
+    </w:p>
+    <w:p>
+      <w:pPr>
+        <w:pStyle w:val="ListBullet"/>
+      </w:pPr>
+      <w:r>
+        <w:t>test_multiplatform_credentials_format</w:t>
+      </w:r>
+    </w:p>
+    <w:p>
+      <w:pPr>
+        <w:pStyle w:val="ListBullet"/>
+      </w:pPr>
+      <w:r>
+        <w:t>test_load_daily_series_with_platform_filter</w:t>
+      </w:r>
+    </w:p>
+    <w:p>
+      <w:pPr>
+        <w:pStyle w:val="ListBullet"/>
+      </w:pPr>
+      <w:r>
+        <w:t>test_csv_naming_convention_dessmonitor</w:t>
+      </w:r>
+    </w:p>
+    <w:p>
+      <w:pPr>
+        <w:pStyle w:val="ListBullet"/>
+      </w:pPr>
+      <w:r>
+        <w:t>test_platform_label_in_alerts</w:t>
+      </w:r>
+    </w:p>
+    <w:p>
+      <w:pPr>
+        <w:pStyle w:val="ListBullet"/>
+      </w:pPr>
+      <w:r>
+        <w:t>test_separate_state_files_per_platform</w:t>
+      </w:r>
+    </w:p>
+    <w:p>
+      <w:pPr>
+        <w:pStyle w:val="ListBullet"/>
+      </w:pPr>
+      <w:r>
+        <w:t>test_api_endpoint_configuration</w:t>
+      </w:r>
+    </w:p>
+    <w:p>
+      <w:pPr>
+        <w:pStyle w:val="ListBullet"/>
+      </w:pPr>
+      <w:r>
+        <w:t>test_authentication_signature_format</w:t>
+      </w:r>
+    </w:p>
+    <w:p>
+      <w:pPr>
+        <w:pStyle w:val="ListBullet"/>
+      </w:pPr>
+      <w:r>
+        <w:t>test_api_actions_available</w:t>
+      </w:r>
+    </w:p>
+    <w:p>
+      <w:pPr>
+        <w:pStyle w:val="ListBullet"/>
+      </w:pPr>
+      <w:r>
+        <w:t>test_combined_alert_email_subject</w:t>
+      </w:r>
+    </w:p>
+    <w:p>
+      <w:pPr>
+        <w:pStyle w:val="ListBullet"/>
+      </w:pPr>
+      <w:r>
+        <w:t>test_alerts_tagged_with_platform</w:t>
+      </w:r>
+    </w:p>
+    <w:p>
+      <w:pPr>
+        <w:pStyle w:val="ListBullet"/>
+      </w:pPr>
+      <w:r>
+        <w:t>test_old_credentials_format_still_works</w:t>
+      </w:r>
+    </w:p>
+    <w:p>
+      <w:pPr>
+        <w:pStyle w:val="ListBullet"/>
+      </w:pPr>
+      <w:r>
+        <w:t>test_shinemonitor_csv_naming_unchanged</w:t>
+      </w:r>
+    </w:p>
+    <w:p>
+      <w:r>
+        <w:br w:type="page"/>
+      </w:r>
+    </w:p>
+    <w:p>
+      <w:pPr>
+        <w:pStyle w:val="Heading1"/>
+      </w:pPr>
+      <w:r>
+        <w:t>UC9 Bug Fix: Hash Timestamp Issue (Session 14)</w:t>
+      </w:r>
+    </w:p>
+    <w:p>
+      <w:pPr>
+        <w:pStyle w:val="Heading2"/>
+      </w:pPr>
+      <w:r>
+        <w:t>Problem</w:t>
+      </w:r>
+    </w:p>
+    <w:p>
+      <w:r>
+        <w:t>Admin emails were sent 6x daily even when alert content was unchanged.</w:t>
+      </w:r>
+    </w:p>
+    <w:p>
+      <w:pPr>
+        <w:pStyle w:val="Heading2"/>
+      </w:pPr>
+      <w:r>
+        <w:t>Root Cause</w:t>
+      </w:r>
+    </w:p>
+    <w:p>
+      <w:r>
+        <w:t>The alerts.json file includes a "generated_at" timestamp that changes on every run. The previous implementation hashed the entire file, so the hash always changed even when alert content (alerts, suppressed, ignored arrays) remained the same.</w:t>
+      </w:r>
+    </w:p>
+    <w:p>
+      <w:pPr>
+        <w:pStyle w:val="Heading2"/>
+      </w:pPr>
+      <w:r>
+        <w:t>Fix</w:t>
+      </w:r>
+    </w:p>
+    <w:p>
+      <w:r>
+        <w:t>Use jq to extract only alert content before hashing:</w:t>
+      </w:r>
+    </w:p>
+    <w:p>
+      <w:r>
+        <w:rPr>
+          <w:b/>
+        </w:rPr>
+        <w:t># Before (buggy):</w:t>
+        <w:br/>
+      </w:r>
+      <w:r>
+        <w:t>sha256sum alerts/alerts.json</w:t>
+        <w:br/>
+        <w:br/>
+      </w:r>
+      <w:r>
+        <w:rPr>
+          <w:b/>
+        </w:rPr>
+        <w:t># After (fixed):</w:t>
+        <w:br/>
+      </w:r>
+      <w:r>
+        <w:t>jq -cS '{alerts, suppressed, ignored}' alerts/alerts.json | sha256sum</w:t>
+      </w:r>
+    </w:p>
+    <w:p>
+      <w:pPr>
+        <w:pStyle w:val="Heading2"/>
+      </w:pPr>
+      <w:r>
+        <w:t>Impact</w:t>
+      </w:r>
+    </w:p>
+    <w:p>
+      <w:r>
+        <w:t>Email reduction from 6 emails/day to ~1-2 emails/day (83% reduction)</w:t>
+      </w:r>
+    </w:p>
+    <w:p>
+      <w:pPr>
+        <w:pStyle w:val="Heading2"/>
+      </w:pPr>
+      <w:r>
+        <w:t>New Tests Added</w:t>
+      </w:r>
+    </w:p>
+    <w:p>
+      <w:pPr>
+        <w:pStyle w:val="ListBullet"/>
+      </w:pPr>
+      <w:r>
+        <w:t>test_uc9_hash_excludes_generated_at_timestamp - Verifies content-only hashing</w:t>
+      </w:r>
+    </w:p>
+    <w:p>
+      <w:pPr>
+        <w:pStyle w:val="ListBullet"/>
+      </w:pPr>
+      <w:r>
+        <w:t>test_uc9_workflow_uses_content_only_hash - Verifies workflow uses jq</w:t>
       </w:r>
     </w:p>
     <w:sectPr>

</xml_diff>